<commit_message>
docs: declare two-LLM protocol and PM Plan change in Oct 18 Milestone 2
</commit_message>
<xml_diff>
--- a/docs/J_O_INAI6986_Log2_20261018.docx
+++ b/docs/J_O_INAI6986_Log2_20261018.docx
@@ -336,7 +336,7 @@
                 <w:color w:val="1F2A44"/>
                 <w:sz w:val="18"/>
               </w:rPr>
-              <w:t>Before Milestone 2 (October 25): 1) Generate, source-check and lock the fresh benchmark, including unanswerable questions. 2) Run the one-time test of the Nemotron adapter against its base with the source passage supplied. 3) Rate the final outputs myself, run the robustness and subgroup analyses, and write Milestone 2.</w:t>
+              <w:t>Before Milestone 2 (October 25): 1) Generate, source-check and lock the fresh benchmark, including unanswerable questions. 2) Run the one-time test of the Nemotron adapter against its base with the source passage supplied. 3) Score the final outputs with two LLM judges and a code check of citations (my October 18 decision; no human rating sample), run the robustness and subgroup analyses, and write Milestone 2.</w:t>
             </w:r>
           </w:p>
         </w:tc>
@@ -411,7 +411,7 @@
           <w:color w:val="1F2A44"/>
           <w:sz w:val="17"/>
         </w:rPr>
-        <w:t>Hermes Agent (GPT-6 Luna and GPT-6.1 Sol; Claude Opus 5.5 for the October 18 revision) drafted this log from my project records; local Qwen models produced the advisory development scores. I made the ratings, rulings and decisions reported here, estimated the hours, checked the log against the records and remain responsible for it.</w:t>
+        <w:t>Hermes Agent (GPT-6 Luna and GPT-6.1 Sol; Claude Opus 5.5 for the initial October 18 revision and Claude Sonnet 5.5 for the same-day protocol update) drafted this log from my project records; local Qwen models produced the advisory development scores. I made the ratings, rulings and decisions reported here, estimated the hours, checked the log against the records and remain responsible for it.</w:t>
       </w:r>
     </w:p>
     <w:sectPr>

</xml_diff>